<commit_message>
Update sample-menu-short-set.docx with new sample menu
</commit_message>
<xml_diff>
--- a/sample-menu-short-set.docx
+++ b/sample-menu-short-set.docx
@@ -1,6 +1,6 @@
 
 <file path=word/document.xml><?xml version="1.0" encoding="utf-8"?>
-<w:document xmlns:wpc="http://schemas.microsoft.com/office/word/2010/wordprocessingCanvas" xmlns:cx="http://schemas.microsoft.com/office/drawing/2014/chartex" xmlns:cx1="http://schemas.microsoft.com/office/drawing/2015/9/8/chartex" xmlns:cx2="http://schemas.microsoft.com/office/drawing/2015/10/21/chartex" xmlns:cx3="http://schemas.microsoft.com/office/drawing/2016/5/9/chartex" xmlns:cx4="http://schemas.microsoft.com/office/drawing/2016/5/10/chartex" xmlns:cx5="http://schemas.microsoft.com/office/drawing/2016/5/11/chartex" xmlns:cx6="http://schemas.microsoft.com/office/drawing/2016/5/12/chartex" xmlns:cx7="http://schemas.microsoft.com/office/drawing/2016/5/13/chartex" xmlns:cx8="http://schemas.microsoft.com/office/drawing/2016/5/14/chartex" xmlns:mc="http://schemas.openxmlformats.org/markup-compatibility/2006" xmlns:m="http://schemas.openxmlformats.org/officeDocument/2006/math" xmlns:aink="http://schemas.microsoft.com/office/drawing/2016/ink" xmlns:am3d="http://schemas.microsoft.com/office/drawing/2017/model3d" xmlns:oel="http://schemas.microsoft.com/office/2019/extlst" xmlns:r="http://schemas.openxmlformats.org/officeDocument/2006/relationships" xmlns:wp14="http://schemas.microsoft.com/office/word/2010/wordprocessingDrawing" xmlns:wp="http://schemas.openxmlformats.org/drawingml/2006/wordprocessingDrawing" xmlns:wpg="http://schemas.microsoft.com/office/word/2010/wordprocessingGroup" xmlns:wpi="http://schemas.microsoft.com/office/word/2010/wordprocessingInk" xmlns:wps="http://schemas.microsoft.com/office/word/2010/wordprocessingShape" xmlns:o="urn:schemas-microsoft-com:office:office" xmlns:v="urn:schemas-microsoft-com:vml" xmlns:w10="urn:schemas-microsoft-com:office:word" xmlns:w="http://schemas.openxmlformats.org/wordprocessingml/2006/main" xmlns:w14="http://schemas.microsoft.com/office/word/2010/wordml" xmlns:w15="http://schemas.microsoft.com/office/word/2012/wordml" xmlns:w16cei="http://schemas.microsoft.com/office/word/2026/wordml/cei" xmlns:w16cex="http://schemas.microsoft.com/office/word/2018/wordml/cex" xmlns:w16cid="http://schemas.microsoft.com/office/word/2016/wordml/cid" xmlns:w16="http://schemas.microsoft.com/office/word/2018/wordml" xmlns:w16sdtdh="http://schemas.microsoft.com/office/word/2020/wordml/sdtdatahash" xmlns:w16sdtfl="http://schemas.microsoft.com/office/word/2024/wordml/sdtformatlock" xmlns:w16se="http://schemas.microsoft.com/office/word/2015/wordml/symex" xmlns:w16du="http://schemas.microsoft.com/office/word/2023/wordml/word16du" xmlns:wne="http://schemas.microsoft.com/office/word/2006/wordml" mc:Ignorable="w14 w15 w16se w16cid w16 w16cex w16sdtdh w16sdtfl w16du wp14">
+<w:document xmlns:wpc="http://schemas.microsoft.com/office/word/2010/wordprocessingCanvas" xmlns:cx="http://schemas.microsoft.com/office/drawing/2014/chartex" xmlns:cx1="http://schemas.microsoft.com/office/drawing/2015/9/8/chartex" xmlns:cx2="http://schemas.microsoft.com/office/drawing/2015/10/21/chartex" xmlns:cx3="http://schemas.microsoft.com/office/drawing/2016/5/9/chartex" xmlns:cx4="http://schemas.microsoft.com/office/drawing/2016/5/10/chartex" xmlns:cx5="http://schemas.microsoft.com/office/drawing/2016/5/11/chartex" xmlns:cx6="http://schemas.microsoft.com/office/drawing/2016/5/12/chartex" xmlns:cx7="http://schemas.microsoft.com/office/drawing/2016/5/13/chartex" xmlns:cx8="http://schemas.microsoft.com/office/drawing/2016/5/14/chartex" xmlns:mc="http://schemas.openxmlformats.org/markup-compatibility/2006" xmlns:m="http://schemas.openxmlformats.org/officeDocument/2006/math" xmlns:aink="http://schemas.microsoft.com/office/drawing/2016/ink" xmlns:am3d="http://schemas.microsoft.com/office/drawing/2017/model3d" xmlns:oel="http://schemas.microsoft.com/office/2019/extlst" xmlns:r="http://schemas.openxmlformats.org/officeDocument/2006/relationships" xmlns:wp14="http://schemas.microsoft.com/office/word/2010/wordprocessingDrawing" xmlns:wp="http://schemas.openxmlformats.org/drawingml/2006/wordprocessingDrawing" xmlns:wpg="http://schemas.microsoft.com/office/word/2010/wordprocessingGroup" xmlns:wpi="http://schemas.microsoft.com/office/word/2010/wordprocessingInk" xmlns:wps="http://schemas.microsoft.com/office/word/2010/wordprocessingShape" xmlns:o="urn:schemas-microsoft-com:office:office" xmlns:v="urn:schemas-microsoft-com:vml" xmlns:w10="urn:schemas-microsoft-com:office:word" xmlns:w="http://schemas.openxmlformats.org/wordprocessingml/2006/main" xmlns:w14="http://schemas.microsoft.com/office/word/2010/wordml" xmlns:w15="http://schemas.microsoft.com/office/word/2012/wordml" xmlns:w16cex="http://schemas.microsoft.com/office/word/2018/wordml/cex" xmlns:w16cid="http://schemas.microsoft.com/office/word/2016/wordml/cid" xmlns:w16="http://schemas.microsoft.com/office/word/2018/wordml" xmlns:w16sdtdh="http://schemas.microsoft.com/office/word/2020/wordml/sdtdatahash" xmlns:w16sdtfl="http://schemas.microsoft.com/office/word/2024/wordml/sdtformatlock" xmlns:w16se="http://schemas.microsoft.com/office/word/2015/wordml/symex" xmlns:w16du="http://schemas.microsoft.com/office/word/2023/wordml/word16du" xmlns:wne="http://schemas.microsoft.com/office/word/2006/wordml" mc:Ignorable="w14 w15 w16se w16cid w16 w16cex w16sdtdh w16sdtfl w16du wp14">
   <w:body>
     <w:p>
       <w:pPr>
@@ -8,6 +8,8 @@
           <w:rFonts w:ascii="Geist" w:hAnsi="Geist"/>
           <w:b/>
           <w:bCs/>
+          <w:sz w:val="32"/>
+          <w:szCs w:val="32"/>
         </w:rPr>
       </w:pPr>
     </w:p>
@@ -17,6 +19,8 @@
           <w:rFonts w:ascii="Geist" w:hAnsi="Geist"/>
           <w:b/>
           <w:bCs/>
+          <w:sz w:val="32"/>
+          <w:szCs w:val="32"/>
         </w:rPr>
       </w:pPr>
     </w:p>
@@ -26,36 +30,131 @@
           <w:rFonts w:ascii="Geist" w:hAnsi="Geist"/>
           <w:b/>
           <w:bCs/>
+          <w:sz w:val="32"/>
+          <w:szCs w:val="32"/>
         </w:rPr>
       </w:pPr>
     </w:p>
     <w:p>
       <w:pPr>
         <w:rPr>
-          <w:rFonts w:ascii="Geist" w:hAnsi="Geist"/>
-          <w:b/>
-          <w:bCs/>
+          <w:rFonts w:ascii="Geist" w:hAnsi="Geist" w:cs="Times New Roman (Body CS)"/>
+          <w:b/>
+          <w:bCs/>
+          <w:spacing w:val="40"/>
+          <w:sz w:val="32"/>
+          <w:szCs w:val="32"/>
+        </w:rPr>
+      </w:pPr>
+      <w:r>
+        <w:rPr>
+          <w:rFonts w:ascii="Geist" w:hAnsi="Geist" w:cs="Times New Roman (Body CS)"/>
+          <w:b/>
+          <w:bCs/>
+          <w:spacing w:val="40"/>
+          <w:sz w:val="32"/>
+          <w:szCs w:val="32"/>
+        </w:rPr>
+        <w:t>4</w:t>
+      </w:r>
+      <w:r>
+        <w:rPr>
+          <w:rFonts w:ascii="Geist" w:hAnsi="Geist" w:cs="Times New Roman (Body CS)"/>
+          <w:b/>
+          <w:bCs/>
+          <w:spacing w:val="40"/>
+          <w:sz w:val="32"/>
+          <w:szCs w:val="32"/>
+        </w:rPr>
+        <w:t xml:space="preserve"> COURSE </w:t>
+      </w:r>
+      <w:r>
+        <w:rPr>
+          <w:rFonts w:ascii="Geist" w:hAnsi="Geist" w:cs="Times New Roman (Body CS)"/>
+          <w:b/>
+          <w:bCs/>
+          <w:spacing w:val="40"/>
+          <w:sz w:val="32"/>
+          <w:szCs w:val="32"/>
+        </w:rPr>
+        <w:t xml:space="preserve">SHORT </w:t>
+      </w:r>
+      <w:r>
+        <w:rPr>
+          <w:rFonts w:ascii="Geist" w:hAnsi="Geist" w:cs="Times New Roman (Body CS)"/>
+          <w:b/>
+          <w:bCs/>
+          <w:spacing w:val="40"/>
+          <w:sz w:val="32"/>
+          <w:szCs w:val="32"/>
+        </w:rPr>
+        <w:t>SET MENU £</w:t>
+      </w:r>
+      <w:r>
+        <w:rPr>
+          <w:rFonts w:ascii="Geist" w:hAnsi="Geist" w:cs="Times New Roman (Body CS)"/>
+          <w:b/>
+          <w:bCs/>
+          <w:spacing w:val="40"/>
+          <w:sz w:val="32"/>
+          <w:szCs w:val="32"/>
+        </w:rPr>
+        <w:t>35</w:t>
+      </w:r>
+      <w:r>
+        <w:rPr>
+          <w:rFonts w:ascii="Geist" w:hAnsi="Geist" w:cs="Times New Roman (Body CS)"/>
+          <w:b/>
+          <w:bCs/>
+          <w:spacing w:val="40"/>
+          <w:sz w:val="32"/>
+          <w:szCs w:val="32"/>
+        </w:rPr>
+        <w:t xml:space="preserve"> </w:t>
+      </w:r>
+      <w:r>
+        <w:rPr>
+          <w:rFonts w:ascii="Geist" w:hAnsi="Geist" w:cs="Times New Roman (Body CS)"/>
+          <w:spacing w:val="40"/>
+          <w:sz w:val="32"/>
+          <w:szCs w:val="32"/>
+        </w:rPr>
+        <w:t>*SAMPLE</w:t>
+      </w:r>
+    </w:p>
+    <w:p>
+      <w:pPr>
+        <w:rPr>
+          <w:rFonts w:ascii="Geist" w:hAnsi="Geist" w:cs="Times New Roman (Body CS)"/>
+          <w:b/>
+          <w:bCs/>
+          <w:spacing w:val="40"/>
+          <w:sz w:val="32"/>
+          <w:szCs w:val="32"/>
         </w:rPr>
       </w:pPr>
     </w:p>
     <w:p>
       <w:pPr>
-        <w:ind w:left="1134"/>
-        <w:rPr>
-          <w:rFonts w:ascii="Geist" w:hAnsi="Geist"/>
-          <w:b/>
-          <w:bCs/>
+        <w:rPr>
+          <w:rFonts w:ascii="Geist" w:hAnsi="Geist" w:cs="Times New Roman (Body CS)"/>
+          <w:b/>
+          <w:bCs/>
+          <w:spacing w:val="40"/>
+          <w:sz w:val="32"/>
+          <w:szCs w:val="32"/>
         </w:rPr>
       </w:pPr>
     </w:p>
     <w:p>
       <w:pPr>
-        <w:ind w:left="1134"/>
-        <w:rPr>
-          <w:rFonts w:ascii="Geist" w:hAnsi="Geist" w:cs="Times New Roman (Body CS)"/>
-          <w:b/>
-          <w:bCs/>
-          <w:spacing w:val="40"/>
+        <w:rPr>
+          <w:rFonts w:ascii="Geist" w:hAnsi="Geist" w:cs="Times New Roman (Body CS)"/>
+          <w:b/>
+          <w:bCs/>
+          <w:spacing w:val="40"/>
+          <w:sz w:val="32"/>
+          <w:szCs w:val="32"/>
         </w:rPr>
       </w:pPr>
       <w:r>
@@ -63,21 +162,119 @@
           <w:rFonts w:ascii="Geist" w:hAnsi="Geist" w:cs="Times New Roman (Body CS)"/>
           <w:b/>
           <w:bCs/>
-          <w:noProof/>
-          <w:spacing w:val="40"/>
-          <w:sz w:val="32"/>
-          <w:szCs w:val="32"/>
+          <w:spacing w:val="40"/>
+          <w:sz w:val="32"/>
+          <w:szCs w:val="32"/>
+        </w:rPr>
+        <w:t>Bread + Snacks</w:t>
+      </w:r>
+    </w:p>
+    <w:p>
+      <w:pPr>
+        <w:rPr>
+          <w:rFonts w:ascii="Geist" w:hAnsi="Geist" w:cs="Times New Roman (Body CS)"/>
+          <w:spacing w:val="40"/>
+          <w:sz w:val="32"/>
+          <w:szCs w:val="32"/>
+        </w:rPr>
+      </w:pPr>
+      <w:r>
+        <w:rPr>
+          <w:rFonts w:ascii="Geist" w:hAnsi="Geist" w:cs="Times New Roman (Body CS)"/>
+          <w:b/>
+          <w:bCs/>
+          <w:spacing w:val="40"/>
+          <w:sz w:val="32"/>
+          <w:szCs w:val="32"/>
+        </w:rPr>
+        <w:t>Sea Bass Crudo.</w:t>
+      </w:r>
+      <w:r>
+        <w:rPr>
+          <w:rFonts w:ascii="Geist" w:hAnsi="Geist" w:cs="Times New Roman (Body CS)"/>
+          <w:spacing w:val="40"/>
+          <w:sz w:val="32"/>
+          <w:szCs w:val="32"/>
+        </w:rPr>
+        <w:t xml:space="preserve"> Apple. Yoghurt</w:t>
+      </w:r>
+    </w:p>
+    <w:p>
+      <w:pPr>
+        <w:rPr>
+          <w:rFonts w:ascii="Geist" w:hAnsi="Geist" w:cs="Times New Roman (Body CS)"/>
+          <w:spacing w:val="40"/>
+          <w:sz w:val="32"/>
+          <w:szCs w:val="32"/>
+        </w:rPr>
+      </w:pPr>
+      <w:r>
+        <w:rPr>
+          <w:rFonts w:ascii="Geist" w:hAnsi="Geist" w:cs="Times New Roman (Body CS)"/>
+          <w:b/>
+          <w:bCs/>
+          <w:spacing w:val="40"/>
+          <w:sz w:val="32"/>
+          <w:szCs w:val="32"/>
+        </w:rPr>
+        <w:t>Hay-Roasted Duck.</w:t>
+      </w:r>
+      <w:r>
+        <w:rPr>
+          <w:rFonts w:ascii="Geist" w:hAnsi="Geist" w:cs="Times New Roman (Body CS)"/>
+          <w:spacing w:val="40"/>
+          <w:sz w:val="32"/>
+          <w:szCs w:val="32"/>
+        </w:rPr>
+        <w:t xml:space="preserve"> Lions Mane. Black Garlic </w:t>
+      </w:r>
+    </w:p>
+    <w:p>
+      <w:pPr>
+        <w:rPr>
+          <w:rFonts w:ascii="Geist" w:hAnsi="Geist" w:cs="Times New Roman (Body CS)"/>
+          <w:spacing w:val="40"/>
+          <w:sz w:val="32"/>
+          <w:szCs w:val="32"/>
+        </w:rPr>
+      </w:pPr>
+      <w:r>
+        <w:rPr>
+          <w:rFonts w:ascii="Geist" w:hAnsi="Geist" w:cs="Times New Roman (Body CS)"/>
+          <w:b/>
+          <w:bCs/>
+          <w:spacing w:val="40"/>
+          <w:sz w:val="32"/>
+          <w:szCs w:val="32"/>
+        </w:rPr>
+        <w:t>Slow-Baked Apple.</w:t>
+      </w:r>
+      <w:r>
+        <w:rPr>
+          <w:rFonts w:ascii="Geist" w:hAnsi="Geist" w:cs="Times New Roman (Body CS)"/>
+          <w:spacing w:val="40"/>
+          <w:sz w:val="32"/>
+          <w:szCs w:val="32"/>
+        </w:rPr>
+        <w:t xml:space="preserve"> Cider. Milk </w:t>
+      </w:r>
+    </w:p>
+    <w:p>
+      <w:r>
+        <w:rPr>
+          <w:b/>
+          <w:bCs/>
         </w:rPr>
         <w:drawing>
-          <wp:anchor distT="0" distB="0" distL="114300" distR="114300" simplePos="0" relativeHeight="251659264" behindDoc="0" locked="0" layoutInCell="1" allowOverlap="1" wp14:anchorId="02FACEC4" wp14:editId="72C8CFE1">
+          <wp:anchor distT="0" distB="0" distL="114300" distR="114300" simplePos="0" relativeHeight="251659264" behindDoc="0" locked="0" layoutInCell="1" allowOverlap="1" wp14:anchorId="2AE28FB3" wp14:editId="07D191D0">
             <wp:simplePos x="0" y="0"/>
             <wp:positionH relativeFrom="column">
-              <wp:posOffset>5738446</wp:posOffset>
+              <wp:posOffset>16510</wp:posOffset>
             </wp:positionH>
             <wp:positionV relativeFrom="paragraph">
-              <wp:posOffset>15875</wp:posOffset>
+              <wp:posOffset>815340</wp:posOffset>
             </wp:positionV>
-            <wp:extent cx="1626235" cy="2256155"/>
+            <wp:extent cx="2074545" cy="2878455"/>
             <wp:effectExtent l="0" t="0" r="0" b="4445"/>
             <wp:wrapSquare wrapText="bothSides"/>
             <wp:docPr id="992876635" name="Picture 3"/>
@@ -106,7 +303,7 @@
                   <pic:spPr>
                     <a:xfrm>
                       <a:off x="0" y="0"/>
-                      <a:ext cx="1626235" cy="2256155"/>
+                      <a:ext cx="2074545" cy="2878455"/>
                     </a:xfrm>
                     <a:prstGeom prst="rect">
                       <a:avLst/>
@@ -124,288 +321,9 @@
           </wp:anchor>
         </w:drawing>
       </w:r>
-      <w:r>
-        <w:rPr>
-          <w:rFonts w:ascii="Geist" w:hAnsi="Geist" w:cs="Times New Roman (Body CS)"/>
-          <w:b/>
-          <w:bCs/>
-          <w:spacing w:val="40"/>
-        </w:rPr>
-        <w:t xml:space="preserve">4 COURSE </w:t>
-      </w:r>
-      <w:r>
-        <w:rPr>
-          <w:rFonts w:ascii="Geist" w:hAnsi="Geist" w:cs="Times New Roman (Body CS)"/>
-          <w:b/>
-          <w:bCs/>
-          <w:spacing w:val="40"/>
-        </w:rPr>
-        <w:t>SHORT SET</w:t>
-      </w:r>
-      <w:r>
-        <w:rPr>
-          <w:rFonts w:ascii="Geist" w:hAnsi="Geist" w:cs="Times New Roman (Body CS)"/>
-          <w:b/>
-          <w:bCs/>
-          <w:spacing w:val="40"/>
-        </w:rPr>
-        <w:t xml:space="preserve"> MENU</w:t>
-      </w:r>
-      <w:r>
-        <w:rPr>
-          <w:rFonts w:ascii="Geist" w:hAnsi="Geist" w:cs="Times New Roman (Body CS)"/>
-          <w:b/>
-          <w:bCs/>
-          <w:spacing w:val="40"/>
-        </w:rPr>
-        <w:t xml:space="preserve"> £35</w:t>
-      </w:r>
-      <w:r>
-        <w:rPr>
-          <w:rFonts w:ascii="Geist" w:hAnsi="Geist" w:cs="Times New Roman (Body CS)"/>
-          <w:b/>
-          <w:bCs/>
-          <w:spacing w:val="40"/>
-        </w:rPr>
-        <w:t xml:space="preserve"> </w:t>
-      </w:r>
-      <w:r>
-        <w:rPr>
-          <w:rFonts w:ascii="Geist" w:hAnsi="Geist" w:cs="Times New Roman (Body CS)"/>
-          <w:spacing w:val="40"/>
-        </w:rPr>
-        <w:t>*</w:t>
-      </w:r>
-      <w:r>
-        <w:rPr>
-          <w:rFonts w:ascii="Geist" w:hAnsi="Geist" w:cs="Times New Roman (Body CS)"/>
-          <w:spacing w:val="40"/>
-        </w:rPr>
-        <w:t>SAMPLE</w:t>
-      </w:r>
-    </w:p>
-    <w:p>
-      <w:pPr>
-        <w:ind w:left="1134"/>
-        <w:rPr>
-          <w:rFonts w:ascii="Geist" w:hAnsi="Geist"/>
-          <w:b/>
-          <w:bCs/>
-        </w:rPr>
-      </w:pPr>
-    </w:p>
-    <w:p>
-      <w:pPr>
-        <w:ind w:left="1134"/>
-        <w:rPr>
-          <w:rFonts w:ascii="Geist" w:hAnsi="Geist"/>
-          <w:b/>
-          <w:bCs/>
-        </w:rPr>
-      </w:pPr>
-    </w:p>
-    <w:p>
-      <w:pPr>
-        <w:ind w:left="1134"/>
-        <w:rPr>
-          <w:rFonts w:ascii="Geist SemiBold" w:hAnsi="Geist SemiBold" w:cs="Times New Roman (Body CS)"/>
-          <w:b/>
-          <w:bCs/>
-          <w:spacing w:val="40"/>
-        </w:rPr>
-      </w:pPr>
-      <w:r>
-        <w:rPr>
-          <w:rFonts w:ascii="Geist SemiBold" w:hAnsi="Geist SemiBold" w:cs="Times New Roman (Body CS)"/>
-          <w:b/>
-          <w:bCs/>
-          <w:spacing w:val="40"/>
-        </w:rPr>
-        <w:t>Bread + Snacks</w:t>
-      </w:r>
-    </w:p>
-    <w:p>
-      <w:pPr>
-        <w:ind w:left="1134"/>
-        <w:rPr>
-          <w:rFonts w:ascii="Geist" w:hAnsi="Geist" w:cs="Times New Roman (Body CS)"/>
-          <w:spacing w:val="40"/>
-        </w:rPr>
-      </w:pPr>
-      <w:r>
-        <w:rPr>
-          <w:rFonts w:ascii="Geist SemiBold" w:hAnsi="Geist SemiBold" w:cs="Times New Roman (Body CS)"/>
-          <w:b/>
-          <w:bCs/>
-          <w:spacing w:val="40"/>
-        </w:rPr>
-        <w:t>Sea Bass Crudo.</w:t>
-      </w:r>
-      <w:r>
-        <w:rPr>
-          <w:rFonts w:ascii="Geist Light" w:hAnsi="Geist Light" w:cs="Times New Roman (Body CS)"/>
-          <w:spacing w:val="40"/>
-        </w:rPr>
-        <w:t xml:space="preserve"> </w:t>
-      </w:r>
-      <w:r>
-        <w:rPr>
-          <w:rFonts w:ascii="Geist" w:hAnsi="Geist" w:cs="Times New Roman (Body CS)"/>
-          <w:spacing w:val="40"/>
-        </w:rPr>
-        <w:t>Apple. Yoghurt</w:t>
-      </w:r>
-    </w:p>
-    <w:p>
-      <w:pPr>
-        <w:ind w:left="1134"/>
-        <w:rPr>
-          <w:rFonts w:ascii="Geist Light" w:hAnsi="Geist Light" w:cs="Times New Roman (Body CS)"/>
-          <w:spacing w:val="40"/>
-        </w:rPr>
-      </w:pPr>
-      <w:r>
-        <w:rPr>
-          <w:rFonts w:ascii="Geist SemiBold" w:hAnsi="Geist SemiBold" w:cs="Times New Roman (Body CS)"/>
-          <w:b/>
-          <w:bCs/>
-          <w:spacing w:val="40"/>
-        </w:rPr>
-        <w:t>Hay-Roasted Duck.</w:t>
-      </w:r>
-      <w:r>
-        <w:rPr>
-          <w:rFonts w:ascii="Geist Light" w:hAnsi="Geist Light" w:cs="Times New Roman (Body CS)"/>
-          <w:spacing w:val="40"/>
-        </w:rPr>
-        <w:t xml:space="preserve"> </w:t>
-      </w:r>
-      <w:r>
-        <w:rPr>
-          <w:rFonts w:ascii="Geist" w:hAnsi="Geist" w:cs="Times New Roman (Body CS)"/>
-          <w:spacing w:val="40"/>
-        </w:rPr>
-        <w:t>Lions Mane. Black Garlic</w:t>
-      </w:r>
-      <w:r>
-        <w:rPr>
-          <w:rFonts w:ascii="Geist Light" w:hAnsi="Geist Light" w:cs="Times New Roman (Body CS)"/>
-          <w:spacing w:val="40"/>
-        </w:rPr>
-        <w:t xml:space="preserve"> </w:t>
-      </w:r>
-    </w:p>
-    <w:p>
-      <w:pPr>
-        <w:ind w:left="1134"/>
-        <w:rPr>
-          <w:rFonts w:ascii="Geist" w:hAnsi="Geist"/>
-        </w:rPr>
-      </w:pPr>
-      <w:r>
-        <w:rPr>
-          <w:rFonts w:ascii="Geist SemiBold" w:hAnsi="Geist SemiBold" w:cs="Times New Roman (Body CS)"/>
-          <w:b/>
-          <w:bCs/>
-          <w:spacing w:val="40"/>
-        </w:rPr>
-        <w:t>Slow-</w:t>
-      </w:r>
-      <w:r>
-        <w:rPr>
-          <w:rFonts w:ascii="Geist SemiBold" w:hAnsi="Geist SemiBold" w:cs="Times New Roman (Body CS)"/>
-          <w:b/>
-          <w:bCs/>
-          <w:spacing w:val="40"/>
-        </w:rPr>
-        <w:t>Baked</w:t>
-      </w:r>
-      <w:r>
-        <w:rPr>
-          <w:rFonts w:ascii="Geist SemiBold" w:hAnsi="Geist SemiBold" w:cs="Times New Roman (Body CS)"/>
-          <w:b/>
-          <w:bCs/>
-          <w:spacing w:val="40"/>
-        </w:rPr>
-        <w:t xml:space="preserve"> Apple.</w:t>
-      </w:r>
-      <w:r>
-        <w:rPr>
-          <w:rFonts w:ascii="Geist Light" w:hAnsi="Geist Light" w:cs="Times New Roman (Body CS)"/>
-          <w:spacing w:val="40"/>
-        </w:rPr>
-        <w:t xml:space="preserve"> </w:t>
-      </w:r>
-      <w:r>
-        <w:rPr>
-          <w:rFonts w:ascii="Geist" w:hAnsi="Geist" w:cs="Times New Roman (Body CS)"/>
-          <w:spacing w:val="40"/>
-        </w:rPr>
-        <w:t>Cider. Milk</w:t>
-      </w:r>
-      <w:r>
-        <w:rPr>
-          <w:rFonts w:ascii="Geist" w:hAnsi="Geist"/>
-        </w:rPr>
-        <w:t xml:space="preserve"> </w:t>
-      </w:r>
-    </w:p>
-    <w:p/>
-    <w:p/>
-    <w:p/>
-    <w:p/>
-    <w:p>
-      <w:pPr>
-        <w:ind w:left="414" w:firstLine="720"/>
-        <w:rPr>
-          <w:rFonts w:ascii="Geist Light" w:hAnsi="Geist Light"/>
-          <w:i/>
-          <w:iCs/>
-        </w:rPr>
-      </w:pPr>
-      <w:r>
-        <w:rPr>
-          <w:rFonts w:ascii="Geist Light" w:hAnsi="Geist Light"/>
-          <w:i/>
-          <w:iCs/>
-        </w:rPr>
-        <w:t xml:space="preserve">^Dietary + </w:t>
-      </w:r>
-      <w:r>
-        <w:rPr>
-          <w:rFonts w:ascii="Geist Light" w:hAnsi="Geist Light"/>
-          <w:i/>
-          <w:iCs/>
-        </w:rPr>
-        <w:t>a</w:t>
-      </w:r>
-      <w:r>
-        <w:rPr>
-          <w:rFonts w:ascii="Geist Light" w:hAnsi="Geist Light"/>
-          <w:i/>
-          <w:iCs/>
-        </w:rPr>
-        <w:t>llergy requirements can be catered fo</w:t>
-      </w:r>
-      <w:r>
-        <w:rPr>
-          <w:rFonts w:ascii="Geist Light" w:hAnsi="Geist Light"/>
-          <w:i/>
-          <w:iCs/>
-        </w:rPr>
-        <w:t>r - p</w:t>
-      </w:r>
-      <w:r>
-        <w:rPr>
-          <w:rFonts w:ascii="Geist Light" w:hAnsi="Geist Light"/>
-          <w:i/>
-          <w:iCs/>
-        </w:rPr>
-        <w:t xml:space="preserve">lease specify on booking and give us at least 48hrs notice. </w:t>
-      </w:r>
     </w:p>
     <w:sectPr>
-      <w:pgSz w:w="16838" w:h="11906" w:orient="landscape"/>
+      <w:pgSz w:w="11906" w:h="16838"/>
       <w:pgMar w:top="1440" w:right="1440" w:bottom="1440" w:left="1440" w:header="708" w:footer="708" w:gutter="0"/>
       <w:cols w:space="708"/>
       <w:docGrid w:linePitch="360"/>
@@ -814,7 +732,6 @@
   <w:style w:type="paragraph" w:default="1" w:styleId="Normal">
     <w:name w:val="Normal"/>
     <w:qFormat/>
-    <w:rsid w:val="004D3043"/>
   </w:style>
   <w:style w:type="paragraph" w:styleId="Heading1">
     <w:name w:val="heading 1"/>
@@ -823,7 +740,7 @@
     <w:link w:val="Heading1Char"/>
     <w:uiPriority w:val="9"/>
     <w:qFormat/>
-    <w:rsid w:val="004D3043"/>
+    <w:rsid w:val="000A2F59"/>
     <w:pPr>
       <w:keepNext/>
       <w:keepLines/>
@@ -846,7 +763,7 @@
     <w:semiHidden/>
     <w:unhideWhenUsed/>
     <w:qFormat/>
-    <w:rsid w:val="004D3043"/>
+    <w:rsid w:val="000A2F59"/>
     <w:pPr>
       <w:keepNext/>
       <w:keepLines/>
@@ -869,7 +786,7 @@
     <w:semiHidden/>
     <w:unhideWhenUsed/>
     <w:qFormat/>
-    <w:rsid w:val="004D3043"/>
+    <w:rsid w:val="000A2F59"/>
     <w:pPr>
       <w:keepNext/>
       <w:keepLines/>
@@ -892,7 +809,7 @@
     <w:semiHidden/>
     <w:unhideWhenUsed/>
     <w:qFormat/>
-    <w:rsid w:val="004D3043"/>
+    <w:rsid w:val="000A2F59"/>
     <w:pPr>
       <w:keepNext/>
       <w:keepLines/>
@@ -915,7 +832,7 @@
     <w:semiHidden/>
     <w:unhideWhenUsed/>
     <w:qFormat/>
-    <w:rsid w:val="004D3043"/>
+    <w:rsid w:val="000A2F59"/>
     <w:pPr>
       <w:keepNext/>
       <w:keepLines/>
@@ -936,7 +853,7 @@
     <w:semiHidden/>
     <w:unhideWhenUsed/>
     <w:qFormat/>
-    <w:rsid w:val="004D3043"/>
+    <w:rsid w:val="000A2F59"/>
     <w:pPr>
       <w:keepNext/>
       <w:keepLines/>
@@ -959,7 +876,7 @@
     <w:semiHidden/>
     <w:unhideWhenUsed/>
     <w:qFormat/>
-    <w:rsid w:val="004D3043"/>
+    <w:rsid w:val="000A2F59"/>
     <w:pPr>
       <w:keepNext/>
       <w:keepLines/>
@@ -980,7 +897,7 @@
     <w:semiHidden/>
     <w:unhideWhenUsed/>
     <w:qFormat/>
-    <w:rsid w:val="004D3043"/>
+    <w:rsid w:val="000A2F59"/>
     <w:pPr>
       <w:keepNext/>
       <w:keepLines/>
@@ -1003,7 +920,7 @@
     <w:semiHidden/>
     <w:unhideWhenUsed/>
     <w:qFormat/>
-    <w:rsid w:val="004D3043"/>
+    <w:rsid w:val="000A2F59"/>
     <w:pPr>
       <w:keepNext/>
       <w:keepLines/>
@@ -1018,7 +935,6 @@
   <w:style w:type="character" w:default="1" w:styleId="DefaultParagraphFont">
     <w:name w:val="Default Paragraph Font"/>
     <w:uiPriority w:val="1"/>
-    <w:semiHidden/>
     <w:unhideWhenUsed/>
   </w:style>
   <w:style w:type="table" w:default="1" w:styleId="TableNormal">
@@ -1047,7 +963,7 @@
     <w:basedOn w:val="DefaultParagraphFont"/>
     <w:link w:val="Heading1"/>
     <w:uiPriority w:val="9"/>
-    <w:rsid w:val="004D3043"/>
+    <w:rsid w:val="000A2F59"/>
     <w:rPr>
       <w:rFonts w:asciiTheme="majorHAnsi" w:eastAsiaTheme="majorEastAsia" w:hAnsiTheme="majorHAnsi" w:cstheme="majorBidi"/>
       <w:color w:val="0F4761" w:themeColor="accent1" w:themeShade="BF"/>
@@ -1061,7 +977,7 @@
     <w:link w:val="Heading2"/>
     <w:uiPriority w:val="9"/>
     <w:semiHidden/>
-    <w:rsid w:val="004D3043"/>
+    <w:rsid w:val="000A2F59"/>
     <w:rPr>
       <w:rFonts w:asciiTheme="majorHAnsi" w:eastAsiaTheme="majorEastAsia" w:hAnsiTheme="majorHAnsi" w:cstheme="majorBidi"/>
       <w:color w:val="0F4761" w:themeColor="accent1" w:themeShade="BF"/>
@@ -1075,7 +991,7 @@
     <w:link w:val="Heading3"/>
     <w:uiPriority w:val="9"/>
     <w:semiHidden/>
-    <w:rsid w:val="004D3043"/>
+    <w:rsid w:val="000A2F59"/>
     <w:rPr>
       <w:rFonts w:eastAsiaTheme="majorEastAsia" w:cstheme="majorBidi"/>
       <w:color w:val="0F4761" w:themeColor="accent1" w:themeShade="BF"/>
@@ -1089,7 +1005,7 @@
     <w:link w:val="Heading4"/>
     <w:uiPriority w:val="9"/>
     <w:semiHidden/>
-    <w:rsid w:val="004D3043"/>
+    <w:rsid w:val="000A2F59"/>
     <w:rPr>
       <w:rFonts w:eastAsiaTheme="majorEastAsia" w:cstheme="majorBidi"/>
       <w:i/>
@@ -1103,7 +1019,7 @@
     <w:link w:val="Heading5"/>
     <w:uiPriority w:val="9"/>
     <w:semiHidden/>
-    <w:rsid w:val="004D3043"/>
+    <w:rsid w:val="000A2F59"/>
     <w:rPr>
       <w:rFonts w:eastAsiaTheme="majorEastAsia" w:cstheme="majorBidi"/>
       <w:color w:val="0F4761" w:themeColor="accent1" w:themeShade="BF"/>
@@ -1115,7 +1031,7 @@
     <w:link w:val="Heading6"/>
     <w:uiPriority w:val="9"/>
     <w:semiHidden/>
-    <w:rsid w:val="004D3043"/>
+    <w:rsid w:val="000A2F59"/>
     <w:rPr>
       <w:rFonts w:eastAsiaTheme="majorEastAsia" w:cstheme="majorBidi"/>
       <w:i/>
@@ -1129,7 +1045,7 @@
     <w:link w:val="Heading7"/>
     <w:uiPriority w:val="9"/>
     <w:semiHidden/>
-    <w:rsid w:val="004D3043"/>
+    <w:rsid w:val="000A2F59"/>
     <w:rPr>
       <w:rFonts w:eastAsiaTheme="majorEastAsia" w:cstheme="majorBidi"/>
       <w:color w:val="595959" w:themeColor="text1" w:themeTint="A6"/>
@@ -1141,7 +1057,7 @@
     <w:link w:val="Heading8"/>
     <w:uiPriority w:val="9"/>
     <w:semiHidden/>
-    <w:rsid w:val="004D3043"/>
+    <w:rsid w:val="000A2F59"/>
     <w:rPr>
       <w:rFonts w:eastAsiaTheme="majorEastAsia" w:cstheme="majorBidi"/>
       <w:i/>
@@ -1155,7 +1071,7 @@
     <w:link w:val="Heading9"/>
     <w:uiPriority w:val="9"/>
     <w:semiHidden/>
-    <w:rsid w:val="004D3043"/>
+    <w:rsid w:val="000A2F59"/>
     <w:rPr>
       <w:rFonts w:eastAsiaTheme="majorEastAsia" w:cstheme="majorBidi"/>
       <w:color w:val="272727" w:themeColor="text1" w:themeTint="D8"/>
@@ -1168,7 +1084,7 @@
     <w:link w:val="TitleChar"/>
     <w:uiPriority w:val="10"/>
     <w:qFormat/>
-    <w:rsid w:val="004D3043"/>
+    <w:rsid w:val="000A2F59"/>
     <w:pPr>
       <w:spacing w:after="80" w:line="240" w:lineRule="auto"/>
       <w:contextualSpacing/>
@@ -1186,7 +1102,7 @@
     <w:basedOn w:val="DefaultParagraphFont"/>
     <w:link w:val="Title"/>
     <w:uiPriority w:val="10"/>
-    <w:rsid w:val="004D3043"/>
+    <w:rsid w:val="000A2F59"/>
     <w:rPr>
       <w:rFonts w:asciiTheme="majorHAnsi" w:eastAsiaTheme="majorEastAsia" w:hAnsiTheme="majorHAnsi" w:cstheme="majorBidi"/>
       <w:spacing w:val="-10"/>
@@ -1202,7 +1118,7 @@
     <w:link w:val="SubtitleChar"/>
     <w:uiPriority w:val="11"/>
     <w:qFormat/>
-    <w:rsid w:val="004D3043"/>
+    <w:rsid w:val="000A2F59"/>
     <w:pPr>
       <w:numPr>
         <w:ilvl w:val="1"/>
@@ -1221,7 +1137,7 @@
     <w:basedOn w:val="DefaultParagraphFont"/>
     <w:link w:val="Subtitle"/>
     <w:uiPriority w:val="11"/>
-    <w:rsid w:val="004D3043"/>
+    <w:rsid w:val="000A2F59"/>
     <w:rPr>
       <w:rFonts w:eastAsiaTheme="majorEastAsia" w:cstheme="majorBidi"/>
       <w:color w:val="595959" w:themeColor="text1" w:themeTint="A6"/>
@@ -1237,7 +1153,7 @@
     <w:link w:val="QuoteChar"/>
     <w:uiPriority w:val="29"/>
     <w:qFormat/>
-    <w:rsid w:val="004D3043"/>
+    <w:rsid w:val="000A2F59"/>
     <w:pPr>
       <w:spacing w:before="160"/>
       <w:jc w:val="center"/>
@@ -1253,7 +1169,7 @@
     <w:basedOn w:val="DefaultParagraphFont"/>
     <w:link w:val="Quote"/>
     <w:uiPriority w:val="29"/>
-    <w:rsid w:val="004D3043"/>
+    <w:rsid w:val="000A2F59"/>
     <w:rPr>
       <w:i/>
       <w:iCs/>
@@ -1265,7 +1181,7 @@
     <w:basedOn w:val="Normal"/>
     <w:uiPriority w:val="34"/>
     <w:qFormat/>
-    <w:rsid w:val="004D3043"/>
+    <w:rsid w:val="000A2F59"/>
     <w:pPr>
       <w:ind w:left="720"/>
       <w:contextualSpacing/>
@@ -1276,7 +1192,7 @@
     <w:basedOn w:val="DefaultParagraphFont"/>
     <w:uiPriority w:val="21"/>
     <w:qFormat/>
-    <w:rsid w:val="004D3043"/>
+    <w:rsid w:val="000A2F59"/>
     <w:rPr>
       <w:i/>
       <w:iCs/>
@@ -1290,7 +1206,7 @@
     <w:link w:val="IntenseQuoteChar"/>
     <w:uiPriority w:val="30"/>
     <w:qFormat/>
-    <w:rsid w:val="004D3043"/>
+    <w:rsid w:val="000A2F59"/>
     <w:pPr>
       <w:pBdr>
         <w:top w:val="single" w:sz="4" w:space="10" w:color="0F4761" w:themeColor="accent1" w:themeShade="BF"/>
@@ -1311,7 +1227,7 @@
     <w:basedOn w:val="DefaultParagraphFont"/>
     <w:link w:val="IntenseQuote"/>
     <w:uiPriority w:val="30"/>
-    <w:rsid w:val="004D3043"/>
+    <w:rsid w:val="000A2F59"/>
     <w:rPr>
       <w:i/>
       <w:iCs/>
@@ -1323,7 +1239,7 @@
     <w:basedOn w:val="DefaultParagraphFont"/>
     <w:uiPriority w:val="32"/>
     <w:qFormat/>
-    <w:rsid w:val="004D3043"/>
+    <w:rsid w:val="000A2F59"/>
     <w:rPr>
       <w:b/>
       <w:bCs/>

</xml_diff>